<commit_message>
Added Post,Put Http Methods in OrdersController and map Entities to DTOs, Added documentation
</commit_message>
<xml_diff>
--- a/ReadMe_BE.docx
+++ b/ReadMe_BE.docx
@@ -205,21 +205,12 @@
                 <w:bCs/>
               </w:rPr>
             </w:pPr>
-            <w:proofErr w:type="spellStart"/>
             <w:r>
               <w:rPr>
                 <w:b/>
                 <w:bCs/>
               </w:rPr>
-              <w:t>Column</w:t>
-            </w:r>
-            <w:proofErr w:type="spellEnd"/>
-            <w:r>
-              <w:rPr>
-                <w:b/>
-                <w:bCs/>
-              </w:rPr>
-              <w:t xml:space="preserve"> Name</w:t>
+              <w:t>Column Name</w:t>
             </w:r>
           </w:p>
         </w:tc>
@@ -279,11 +270,9 @@
             <w:hideMark/>
           </w:tcPr>
           <w:p>
-            <w:proofErr w:type="spellStart"/>
             <w:r>
               <w:t>Id</w:t>
             </w:r>
-            <w:proofErr w:type="spellEnd"/>
           </w:p>
         </w:tc>
         <w:tc>
@@ -337,31 +326,21 @@
             <w:hideMark/>
           </w:tcPr>
           <w:p>
-            <w:proofErr w:type="gramStart"/>
-            <w:r>
-              <w:t>NVARCHAR(</w:t>
-            </w:r>
-            <w:proofErr w:type="gramEnd"/>
-            <w:r>
-              <w:t>100)</w:t>
-            </w:r>
-          </w:p>
-        </w:tc>
-        <w:tc>
-          <w:tcPr>
-            <w:tcW w:w="0" w:type="auto"/>
-            <w:vAlign w:val="center"/>
-            <w:hideMark/>
-          </w:tcPr>
-          <w:p>
-            <w:r>
-              <w:t xml:space="preserve">Order </w:t>
-            </w:r>
-            <w:proofErr w:type="spellStart"/>
-            <w:r>
-              <w:t>name</w:t>
-            </w:r>
-            <w:proofErr w:type="spellEnd"/>
+            <w:r>
+              <w:t>NVARCHAR(100)</w:t>
+            </w:r>
+          </w:p>
+        </w:tc>
+        <w:tc>
+          <w:tcPr>
+            <w:tcW w:w="0" w:type="auto"/>
+            <w:vAlign w:val="center"/>
+            <w:hideMark/>
+          </w:tcPr>
+          <w:p>
+            <w:r>
+              <w:t>Order name</w:t>
+            </w:r>
           </w:p>
         </w:tc>
       </w:tr>
@@ -388,31 +367,21 @@
             <w:hideMark/>
           </w:tcPr>
           <w:p>
-            <w:proofErr w:type="gramStart"/>
-            <w:r>
-              <w:t>NVARCHAR(</w:t>
-            </w:r>
-            <w:proofErr w:type="gramEnd"/>
-            <w:r>
-              <w:t>255)</w:t>
-            </w:r>
-          </w:p>
-        </w:tc>
-        <w:tc>
-          <w:tcPr>
-            <w:tcW w:w="0" w:type="auto"/>
-            <w:vAlign w:val="center"/>
-            <w:hideMark/>
-          </w:tcPr>
-          <w:p>
-            <w:r>
-              <w:t xml:space="preserve">Order </w:t>
-            </w:r>
-            <w:proofErr w:type="spellStart"/>
-            <w:r>
-              <w:t>description</w:t>
-            </w:r>
-            <w:proofErr w:type="spellEnd"/>
+            <w:r>
+              <w:t>NVARCHAR(255)</w:t>
+            </w:r>
+          </w:p>
+        </w:tc>
+        <w:tc>
+          <w:tcPr>
+            <w:tcW w:w="0" w:type="auto"/>
+            <w:vAlign w:val="center"/>
+            <w:hideMark/>
+          </w:tcPr>
+          <w:p>
+            <w:r>
+              <w:t>Order description</w:t>
+            </w:r>
           </w:p>
         </w:tc>
       </w:tr>
@@ -427,11 +396,9 @@
             <w:hideMark/>
           </w:tcPr>
           <w:p>
-            <w:proofErr w:type="spellStart"/>
             <w:r>
               <w:t>OrderDate</w:t>
             </w:r>
-            <w:proofErr w:type="spellEnd"/>
           </w:p>
         </w:tc>
         <w:tc>
@@ -454,21 +421,8 @@
           </w:tcPr>
           <w:p>
             <w:r>
-              <w:t xml:space="preserve">Date of </w:t>
-            </w:r>
-            <w:proofErr w:type="spellStart"/>
-            <w:r>
-              <w:t>order</w:t>
-            </w:r>
-            <w:proofErr w:type="spellEnd"/>
-            <w:r>
-              <w:t xml:space="preserve"> </w:t>
-            </w:r>
-            <w:proofErr w:type="spellStart"/>
-            <w:r>
-              <w:t>creation</w:t>
-            </w:r>
-            <w:proofErr w:type="spellEnd"/>
+              <w:t>Date of order creation</w:t>
+            </w:r>
           </w:p>
         </w:tc>
       </w:tr>
@@ -483,11 +437,9 @@
             <w:hideMark/>
           </w:tcPr>
           <w:p>
-            <w:proofErr w:type="spellStart"/>
             <w:r>
               <w:t>CreatedAt</w:t>
             </w:r>
-            <w:proofErr w:type="spellEnd"/>
           </w:p>
         </w:tc>
         <w:tc>
@@ -509,27 +461,9 @@
             <w:hideMark/>
           </w:tcPr>
           <w:p>
-            <w:proofErr w:type="spellStart"/>
-            <w:r>
-              <w:t>Timestamp</w:t>
-            </w:r>
-            <w:proofErr w:type="spellEnd"/>
-            <w:r>
-              <w:t xml:space="preserve"> of </w:t>
-            </w:r>
-            <w:proofErr w:type="spellStart"/>
-            <w:r>
-              <w:t>order</w:t>
-            </w:r>
-            <w:proofErr w:type="spellEnd"/>
-            <w:r>
-              <w:t xml:space="preserve"> </w:t>
-            </w:r>
-            <w:proofErr w:type="spellStart"/>
-            <w:r>
-              <w:t>creation</w:t>
-            </w:r>
-            <w:proofErr w:type="spellEnd"/>
+            <w:r>
+              <w:t>Timestamp of order creation</w:t>
+            </w:r>
           </w:p>
         </w:tc>
       </w:tr>
@@ -600,21 +534,12 @@
                 <w:bCs/>
               </w:rPr>
             </w:pPr>
-            <w:proofErr w:type="spellStart"/>
             <w:r>
               <w:rPr>
                 <w:b/>
                 <w:bCs/>
               </w:rPr>
-              <w:t>Column</w:t>
-            </w:r>
-            <w:proofErr w:type="spellEnd"/>
-            <w:r>
-              <w:rPr>
-                <w:b/>
-                <w:bCs/>
-              </w:rPr>
-              <w:t xml:space="preserve"> Name</w:t>
+              <w:t>Column Name</w:t>
             </w:r>
           </w:p>
         </w:tc>
@@ -674,11 +599,9 @@
             <w:hideMark/>
           </w:tcPr>
           <w:p>
-            <w:proofErr w:type="spellStart"/>
             <w:r>
               <w:t>Id</w:t>
             </w:r>
-            <w:proofErr w:type="spellEnd"/>
           </w:p>
         </w:tc>
         <w:tc>
@@ -729,31 +652,21 @@
             <w:hideMark/>
           </w:tcPr>
           <w:p>
-            <w:proofErr w:type="gramStart"/>
-            <w:r>
-              <w:t>NVARCHAR(</w:t>
-            </w:r>
-            <w:proofErr w:type="gramEnd"/>
-            <w:r>
-              <w:t>100)</w:t>
-            </w:r>
-          </w:p>
-        </w:tc>
-        <w:tc>
-          <w:tcPr>
-            <w:tcW w:w="0" w:type="auto"/>
-            <w:vAlign w:val="center"/>
-            <w:hideMark/>
-          </w:tcPr>
-          <w:p>
-            <w:r>
-              <w:t xml:space="preserve">Board </w:t>
-            </w:r>
-            <w:proofErr w:type="spellStart"/>
-            <w:r>
-              <w:t>name</w:t>
-            </w:r>
-            <w:proofErr w:type="spellEnd"/>
+            <w:r>
+              <w:t>NVARCHAR(100)</w:t>
+            </w:r>
+          </w:p>
+        </w:tc>
+        <w:tc>
+          <w:tcPr>
+            <w:tcW w:w="0" w:type="auto"/>
+            <w:vAlign w:val="center"/>
+            <w:hideMark/>
+          </w:tcPr>
+          <w:p>
+            <w:r>
+              <w:t>Board name</w:t>
+            </w:r>
           </w:p>
         </w:tc>
       </w:tr>
@@ -780,31 +693,21 @@
             <w:hideMark/>
           </w:tcPr>
           <w:p>
-            <w:proofErr w:type="gramStart"/>
-            <w:r>
-              <w:t>NVARCHAR(</w:t>
-            </w:r>
-            <w:proofErr w:type="gramEnd"/>
-            <w:r>
-              <w:t>255)</w:t>
-            </w:r>
-          </w:p>
-        </w:tc>
-        <w:tc>
-          <w:tcPr>
-            <w:tcW w:w="0" w:type="auto"/>
-            <w:vAlign w:val="center"/>
-            <w:hideMark/>
-          </w:tcPr>
-          <w:p>
-            <w:r>
-              <w:t xml:space="preserve">Board </w:t>
-            </w:r>
-            <w:proofErr w:type="spellStart"/>
-            <w:r>
-              <w:t>description</w:t>
-            </w:r>
-            <w:proofErr w:type="spellEnd"/>
+            <w:r>
+              <w:t>NVARCHAR(255)</w:t>
+            </w:r>
+          </w:p>
+        </w:tc>
+        <w:tc>
+          <w:tcPr>
+            <w:tcW w:w="0" w:type="auto"/>
+            <w:vAlign w:val="center"/>
+            <w:hideMark/>
+          </w:tcPr>
+          <w:p>
+            <w:r>
+              <w:t>Board description</w:t>
+            </w:r>
           </w:p>
         </w:tc>
       </w:tr>
@@ -819,11 +722,9 @@
             <w:hideMark/>
           </w:tcPr>
           <w:p>
-            <w:proofErr w:type="spellStart"/>
             <w:r>
               <w:t>Length</w:t>
             </w:r>
-            <w:proofErr w:type="spellEnd"/>
           </w:p>
         </w:tc>
         <w:tc>
@@ -846,13 +747,8 @@
           </w:tcPr>
           <w:p>
             <w:r>
-              <w:t xml:space="preserve">Board </w:t>
-            </w:r>
-            <w:proofErr w:type="spellStart"/>
-            <w:r>
-              <w:t>length</w:t>
-            </w:r>
-            <w:proofErr w:type="spellEnd"/>
+              <w:t>Board length</w:t>
+            </w:r>
           </w:p>
         </w:tc>
       </w:tr>
@@ -892,13 +788,8 @@
           </w:tcPr>
           <w:p>
             <w:r>
-              <w:t xml:space="preserve">Board </w:t>
-            </w:r>
-            <w:proofErr w:type="spellStart"/>
-            <w:r>
-              <w:t>width</w:t>
-            </w:r>
-            <w:proofErr w:type="spellEnd"/>
+              <w:t>Board width</w:t>
+            </w:r>
           </w:p>
         </w:tc>
       </w:tr>
@@ -913,11 +804,9 @@
             <w:hideMark/>
           </w:tcPr>
           <w:p>
-            <w:proofErr w:type="spellStart"/>
             <w:r>
               <w:t>CreatedAt</w:t>
             </w:r>
-            <w:proofErr w:type="spellEnd"/>
           </w:p>
         </w:tc>
         <w:tc>
@@ -939,30 +828,15 @@
             <w:hideMark/>
           </w:tcPr>
           <w:p>
-            <w:proofErr w:type="spellStart"/>
             <w:r>
               <w:t>T</w:t>
             </w:r>
             <w:r>
               <w:t>imestamp</w:t>
             </w:r>
-            <w:proofErr w:type="spellEnd"/>
-            <w:r>
-              <w:t xml:space="preserve"> of </w:t>
-            </w:r>
-            <w:proofErr w:type="spellStart"/>
-            <w:r>
-              <w:t>board</w:t>
-            </w:r>
-            <w:proofErr w:type="spellEnd"/>
-            <w:r>
-              <w:t xml:space="preserve"> </w:t>
-            </w:r>
-            <w:proofErr w:type="spellStart"/>
-            <w:r>
-              <w:t>creation</w:t>
-            </w:r>
-            <w:proofErr w:type="spellEnd"/>
+            <w:r>
+              <w:t xml:space="preserve"> of board creation</w:t>
+            </w:r>
           </w:p>
         </w:tc>
       </w:tr>
@@ -1033,22 +907,13 @@
                 <w:bCs/>
               </w:rPr>
             </w:pPr>
-            <w:proofErr w:type="spellStart"/>
             <w:r>
               <w:rPr>
                 <w:b/>
                 <w:bCs/>
               </w:rPr>
               <w:lastRenderedPageBreak/>
-              <w:t>Column</w:t>
-            </w:r>
-            <w:proofErr w:type="spellEnd"/>
-            <w:r>
-              <w:rPr>
-                <w:b/>
-                <w:bCs/>
-              </w:rPr>
-              <w:t xml:space="preserve"> Name</w:t>
+              <w:t>Column Name</w:t>
             </w:r>
           </w:p>
         </w:tc>
@@ -1108,11 +973,9 @@
             <w:hideMark/>
           </w:tcPr>
           <w:p>
-            <w:proofErr w:type="spellStart"/>
             <w:r>
               <w:t>Id</w:t>
             </w:r>
-            <w:proofErr w:type="spellEnd"/>
           </w:p>
         </w:tc>
         <w:tc>
@@ -1166,36 +1029,21 @@
             <w:hideMark/>
           </w:tcPr>
           <w:p>
-            <w:proofErr w:type="gramStart"/>
-            <w:r>
-              <w:t>NVARCHAR(</w:t>
-            </w:r>
-            <w:proofErr w:type="gramEnd"/>
-            <w:r>
-              <w:t>100)</w:t>
-            </w:r>
-          </w:p>
-        </w:tc>
-        <w:tc>
-          <w:tcPr>
-            <w:tcW w:w="0" w:type="auto"/>
-            <w:vAlign w:val="center"/>
-            <w:hideMark/>
-          </w:tcPr>
-          <w:p>
-            <w:proofErr w:type="spellStart"/>
-            <w:r>
-              <w:t>Component</w:t>
-            </w:r>
-            <w:proofErr w:type="spellEnd"/>
-            <w:r>
-              <w:t xml:space="preserve"> </w:t>
-            </w:r>
-            <w:proofErr w:type="spellStart"/>
-            <w:r>
-              <w:t>name</w:t>
-            </w:r>
-            <w:proofErr w:type="spellEnd"/>
+            <w:r>
+              <w:t>NVARCHAR(100)</w:t>
+            </w:r>
+          </w:p>
+        </w:tc>
+        <w:tc>
+          <w:tcPr>
+            <w:tcW w:w="0" w:type="auto"/>
+            <w:vAlign w:val="center"/>
+            <w:hideMark/>
+          </w:tcPr>
+          <w:p>
+            <w:r>
+              <w:t>Component name</w:t>
+            </w:r>
           </w:p>
         </w:tc>
       </w:tr>
@@ -1222,36 +1070,21 @@
             <w:hideMark/>
           </w:tcPr>
           <w:p>
-            <w:proofErr w:type="gramStart"/>
-            <w:r>
-              <w:t>NVARCHAR(</w:t>
-            </w:r>
-            <w:proofErr w:type="gramEnd"/>
-            <w:r>
-              <w:t>255)</w:t>
-            </w:r>
-          </w:p>
-        </w:tc>
-        <w:tc>
-          <w:tcPr>
-            <w:tcW w:w="0" w:type="auto"/>
-            <w:vAlign w:val="center"/>
-            <w:hideMark/>
-          </w:tcPr>
-          <w:p>
-            <w:proofErr w:type="spellStart"/>
-            <w:r>
-              <w:t>Component</w:t>
-            </w:r>
-            <w:proofErr w:type="spellEnd"/>
-            <w:r>
-              <w:t xml:space="preserve"> </w:t>
-            </w:r>
-            <w:proofErr w:type="spellStart"/>
-            <w:r>
-              <w:t>description</w:t>
-            </w:r>
-            <w:proofErr w:type="spellEnd"/>
+            <w:r>
+              <w:t>NVARCHAR(255)</w:t>
+            </w:r>
+          </w:p>
+        </w:tc>
+        <w:tc>
+          <w:tcPr>
+            <w:tcW w:w="0" w:type="auto"/>
+            <w:vAlign w:val="center"/>
+            <w:hideMark/>
+          </w:tcPr>
+          <w:p>
+            <w:r>
+              <w:t>Component description</w:t>
+            </w:r>
           </w:p>
         </w:tc>
       </w:tr>
@@ -1266,11 +1099,9 @@
             <w:hideMark/>
           </w:tcPr>
           <w:p>
-            <w:proofErr w:type="spellStart"/>
             <w:r>
               <w:t>CreatedAt</w:t>
             </w:r>
-            <w:proofErr w:type="spellEnd"/>
           </w:p>
         </w:tc>
         <w:tc>
@@ -1292,27 +1123,9 @@
             <w:hideMark/>
           </w:tcPr>
           <w:p>
-            <w:proofErr w:type="spellStart"/>
-            <w:r>
-              <w:t>Record</w:t>
-            </w:r>
-            <w:proofErr w:type="spellEnd"/>
-            <w:r>
-              <w:t xml:space="preserve"> </w:t>
-            </w:r>
-            <w:proofErr w:type="spellStart"/>
-            <w:r>
-              <w:t>creation</w:t>
-            </w:r>
-            <w:proofErr w:type="spellEnd"/>
-            <w:r>
-              <w:t xml:space="preserve"> </w:t>
-            </w:r>
-            <w:proofErr w:type="spellStart"/>
-            <w:r>
-              <w:t>timestamp</w:t>
-            </w:r>
-            <w:proofErr w:type="spellEnd"/>
+            <w:r>
+              <w:t>Record creation timestamp</w:t>
+            </w:r>
           </w:p>
         </w:tc>
       </w:tr>
@@ -1359,35 +1172,7 @@
         <w:rPr>
           <w:lang w:val="en-US"/>
         </w:rPr>
-        <w:t xml:space="preserve"> </w:t>
-      </w:r>
-      <w:proofErr w:type="gramStart"/>
-      <w:r>
-        <w:rPr>
-          <w:lang w:val="en-US"/>
-        </w:rPr>
-        <w:t>So</w:t>
-      </w:r>
-      <w:proofErr w:type="gramEnd"/>
-      <w:r>
-        <w:rPr>
-          <w:lang w:val="en-US"/>
-        </w:rPr>
-        <w:t xml:space="preserve"> the quantity is in the </w:t>
-      </w:r>
-      <w:proofErr w:type="spellStart"/>
-      <w:r>
-        <w:rPr>
-          <w:lang w:val="en-US"/>
-        </w:rPr>
-        <w:t>BoardComponent</w:t>
-      </w:r>
-      <w:proofErr w:type="spellEnd"/>
-      <w:r>
-        <w:rPr>
-          <w:lang w:val="en-US"/>
-        </w:rPr>
-        <w:t xml:space="preserve"> table. </w:t>
+        <w:t xml:space="preserve"> So the quantity is in the BoardComponent table. </w:t>
       </w:r>
     </w:p>
     <w:p>
@@ -1426,17 +1211,8 @@
           <w:b/>
           <w:bCs/>
         </w:rPr>
-        <w:t xml:space="preserve">Table: </w:t>
-      </w:r>
-      <w:proofErr w:type="spellStart"/>
-      <w:r>
-        <w:rPr>
-          <w:b/>
-          <w:bCs/>
-        </w:rPr>
-        <w:t>OrderBoards</w:t>
-      </w:r>
-      <w:proofErr w:type="spellEnd"/>
+        <w:t>Table: OrderBoards</w:t>
+      </w:r>
     </w:p>
     <w:tbl>
       <w:tblPr>
@@ -1473,21 +1249,12 @@
                 <w:bCs/>
               </w:rPr>
             </w:pPr>
-            <w:proofErr w:type="spellStart"/>
             <w:r>
               <w:rPr>
                 <w:b/>
                 <w:bCs/>
               </w:rPr>
-              <w:t>Column</w:t>
-            </w:r>
-            <w:proofErr w:type="spellEnd"/>
-            <w:r>
-              <w:rPr>
-                <w:b/>
-                <w:bCs/>
-              </w:rPr>
-              <w:t xml:space="preserve"> Name</w:t>
+              <w:t>Column Name</w:t>
             </w:r>
           </w:p>
         </w:tc>
@@ -1547,11 +1314,9 @@
             <w:hideMark/>
           </w:tcPr>
           <w:p>
-            <w:proofErr w:type="spellStart"/>
             <w:r>
               <w:t>OrderId</w:t>
             </w:r>
-            <w:proofErr w:type="spellEnd"/>
           </w:p>
         </w:tc>
         <w:tc>
@@ -1580,20 +1345,7 @@
               <w:t>K -</w:t>
             </w:r>
             <w:r>
-              <w:t xml:space="preserve"> </w:t>
-            </w:r>
-            <w:proofErr w:type="gramStart"/>
-            <w:r>
-              <w:t>Orders(</w:t>
-            </w:r>
-            <w:proofErr w:type="spellStart"/>
-            <w:proofErr w:type="gramEnd"/>
-            <w:r>
-              <w:t>Id</w:t>
-            </w:r>
-            <w:proofErr w:type="spellEnd"/>
-            <w:r>
-              <w:t>)</w:t>
+              <w:t xml:space="preserve"> Orders(Id)</w:t>
             </w:r>
           </w:p>
         </w:tc>
@@ -1609,11 +1361,9 @@
             <w:hideMark/>
           </w:tcPr>
           <w:p>
-            <w:proofErr w:type="spellStart"/>
             <w:r>
               <w:t>BoardId</w:t>
             </w:r>
-            <w:proofErr w:type="spellEnd"/>
           </w:p>
         </w:tc>
         <w:tc>
@@ -1644,24 +1394,11 @@
             <w:r>
               <w:t xml:space="preserve"> </w:t>
             </w:r>
-            <w:proofErr w:type="gramStart"/>
             <w:r>
               <w:t xml:space="preserve">- </w:t>
             </w:r>
             <w:r>
-              <w:t xml:space="preserve"> Boards</w:t>
-            </w:r>
-            <w:proofErr w:type="gramEnd"/>
-            <w:r>
-              <w:t>(</w:t>
-            </w:r>
-            <w:proofErr w:type="spellStart"/>
-            <w:r>
-              <w:t>Id</w:t>
-            </w:r>
-            <w:proofErr w:type="spellEnd"/>
-            <w:r>
-              <w:t>)</w:t>
+              <w:t xml:space="preserve"> Boards(Id)</w:t>
             </w:r>
           </w:p>
         </w:tc>
@@ -1684,23 +1421,7 @@
     </w:p>
     <w:p>
       <w:r>
-        <w:t>(</w:t>
-      </w:r>
-      <w:proofErr w:type="spellStart"/>
-      <w:r>
-        <w:t>OrderId</w:t>
-      </w:r>
-      <w:proofErr w:type="spellEnd"/>
-      <w:r>
-        <w:t xml:space="preserve">, </w:t>
-      </w:r>
-      <w:proofErr w:type="spellStart"/>
-      <w:r>
-        <w:t>BoardId</w:t>
-      </w:r>
-      <w:proofErr w:type="spellEnd"/>
-      <w:r>
-        <w:t>)</w:t>
+        <w:t>(OrderId, BoardId)</w:t>
       </w:r>
     </w:p>
     <w:p>
@@ -1726,29 +1447,8 @@
         </w:numPr>
       </w:pPr>
       <w:r>
-        <w:t xml:space="preserve">Links </w:t>
-      </w:r>
-      <w:proofErr w:type="spellStart"/>
-      <w:r>
-        <w:t>orders</w:t>
-      </w:r>
-      <w:proofErr w:type="spellEnd"/>
-      <w:r>
-        <w:t xml:space="preserve"> </w:t>
-      </w:r>
-      <w:proofErr w:type="spellStart"/>
-      <w:r>
-        <w:t>to</w:t>
-      </w:r>
-      <w:proofErr w:type="spellEnd"/>
-      <w:r>
-        <w:t xml:space="preserve"> </w:t>
-      </w:r>
-      <w:proofErr w:type="spellStart"/>
-      <w:r>
-        <w:t>boards</w:t>
-      </w:r>
-      <w:proofErr w:type="spellEnd"/>
+        <w:t>Links orders to boards</w:t>
+      </w:r>
     </w:p>
     <w:p>
       <w:pPr>
@@ -1796,17 +1496,8 @@
           <w:b/>
           <w:bCs/>
         </w:rPr>
-        <w:t xml:space="preserve">Table: </w:t>
-      </w:r>
-      <w:proofErr w:type="spellStart"/>
-      <w:r>
-        <w:rPr>
-          <w:b/>
-          <w:bCs/>
-        </w:rPr>
-        <w:t>BoardComponents</w:t>
-      </w:r>
-      <w:proofErr w:type="spellEnd"/>
+        <w:t>Table: BoardComponents</w:t>
+      </w:r>
     </w:p>
     <w:tbl>
       <w:tblPr>
@@ -1843,21 +1534,12 @@
                 <w:bCs/>
               </w:rPr>
             </w:pPr>
-            <w:proofErr w:type="spellStart"/>
             <w:r>
               <w:rPr>
                 <w:b/>
                 <w:bCs/>
               </w:rPr>
-              <w:t>Column</w:t>
-            </w:r>
-            <w:proofErr w:type="spellEnd"/>
-            <w:r>
-              <w:rPr>
-                <w:b/>
-                <w:bCs/>
-              </w:rPr>
-              <w:t xml:space="preserve"> Name</w:t>
+              <w:t>Column Name</w:t>
             </w:r>
           </w:p>
         </w:tc>
@@ -1917,11 +1599,9 @@
             <w:hideMark/>
           </w:tcPr>
           <w:p>
-            <w:proofErr w:type="spellStart"/>
             <w:r>
               <w:t>BoardId</w:t>
             </w:r>
-            <w:proofErr w:type="spellEnd"/>
           </w:p>
         </w:tc>
         <w:tc>
@@ -1953,20 +1633,7 @@
               <w:t>-</w:t>
             </w:r>
             <w:r>
-              <w:t xml:space="preserve"> </w:t>
-            </w:r>
-            <w:proofErr w:type="gramStart"/>
-            <w:r>
-              <w:t>Boards(</w:t>
-            </w:r>
-            <w:proofErr w:type="spellStart"/>
-            <w:proofErr w:type="gramEnd"/>
-            <w:r>
-              <w:t>Id</w:t>
-            </w:r>
-            <w:proofErr w:type="spellEnd"/>
-            <w:r>
-              <w:t>)</w:t>
+              <w:t xml:space="preserve"> Boards(Id)</w:t>
             </w:r>
           </w:p>
         </w:tc>
@@ -1982,11 +1649,9 @@
             <w:hideMark/>
           </w:tcPr>
           <w:p>
-            <w:proofErr w:type="spellStart"/>
             <w:r>
               <w:t>ComponentId</w:t>
             </w:r>
-            <w:proofErr w:type="spellEnd"/>
           </w:p>
         </w:tc>
         <w:tc>
@@ -2021,20 +1686,7 @@
               <w:t>-</w:t>
             </w:r>
             <w:r>
-              <w:t xml:space="preserve"> </w:t>
-            </w:r>
-            <w:proofErr w:type="gramStart"/>
-            <w:r>
-              <w:t>Components(</w:t>
-            </w:r>
-            <w:proofErr w:type="spellStart"/>
-            <w:proofErr w:type="gramEnd"/>
-            <w:r>
-              <w:t>Id</w:t>
-            </w:r>
-            <w:proofErr w:type="spellEnd"/>
-            <w:r>
-              <w:t>)</w:t>
+              <w:t xml:space="preserve"> Components(Id)</w:t>
             </w:r>
           </w:p>
         </w:tc>
@@ -2050,11 +1702,9 @@
             <w:hideMark/>
           </w:tcPr>
           <w:p>
-            <w:proofErr w:type="spellStart"/>
             <w:r>
               <w:t>Quantity</w:t>
             </w:r>
-            <w:proofErr w:type="spellEnd"/>
           </w:p>
         </w:tc>
         <w:tc>
@@ -2118,21 +1768,7 @@
         <w:rPr>
           <w:lang w:val="en-US"/>
         </w:rPr>
-        <w:t xml:space="preserve">(BoardId, </w:t>
-      </w:r>
-      <w:proofErr w:type="spellStart"/>
-      <w:r>
-        <w:rPr>
-          <w:lang w:val="en-US"/>
-        </w:rPr>
-        <w:t>ComponentId</w:t>
-      </w:r>
-      <w:proofErr w:type="spellEnd"/>
-      <w:r>
-        <w:rPr>
-          <w:lang w:val="en-US"/>
-        </w:rPr>
-        <w:t>)</w:t>
+        <w:t>(BoardId, ComponentId)</w:t>
       </w:r>
     </w:p>
     <w:p>
@@ -2160,29 +1796,8 @@
         </w:numPr>
       </w:pPr>
       <w:r>
-        <w:t xml:space="preserve">Links </w:t>
-      </w:r>
-      <w:proofErr w:type="spellStart"/>
-      <w:r>
-        <w:t>boards</w:t>
-      </w:r>
-      <w:proofErr w:type="spellEnd"/>
-      <w:r>
-        <w:t xml:space="preserve"> </w:t>
-      </w:r>
-      <w:proofErr w:type="spellStart"/>
-      <w:r>
-        <w:t>to</w:t>
-      </w:r>
-      <w:proofErr w:type="spellEnd"/>
-      <w:r>
-        <w:t xml:space="preserve"> </w:t>
-      </w:r>
-      <w:proofErr w:type="spellStart"/>
-      <w:r>
-        <w:t>components</w:t>
-      </w:r>
-      <w:proofErr w:type="spellEnd"/>
+        <w:t>Links boards to components</w:t>
+      </w:r>
     </w:p>
     <w:p>
       <w:pPr>
@@ -2192,29 +1807,8 @@
         </w:numPr>
       </w:pPr>
       <w:r>
-        <w:t xml:space="preserve">Stores </w:t>
-      </w:r>
-      <w:proofErr w:type="spellStart"/>
-      <w:r>
-        <w:t>component</w:t>
-      </w:r>
-      <w:proofErr w:type="spellEnd"/>
-      <w:r>
-        <w:t xml:space="preserve"> </w:t>
-      </w:r>
-      <w:proofErr w:type="spellStart"/>
-      <w:r>
-        <w:t>quantity</w:t>
-      </w:r>
-      <w:proofErr w:type="spellEnd"/>
-      <w:r>
-        <w:t xml:space="preserve"> per </w:t>
-      </w:r>
-      <w:proofErr w:type="spellStart"/>
-      <w:r>
-        <w:t>board</w:t>
-      </w:r>
-      <w:proofErr w:type="spellEnd"/>
+        <w:t>Stores component quantity per board</w:t>
+      </w:r>
     </w:p>
     <w:p>
       <w:pPr>
@@ -2273,17 +1867,8 @@
           <w:b/>
           <w:bCs/>
         </w:rPr>
-        <w:t xml:space="preserve">Table: </w:t>
-      </w:r>
-      <w:proofErr w:type="spellStart"/>
-      <w:r>
-        <w:rPr>
-          <w:b/>
-          <w:bCs/>
-        </w:rPr>
-        <w:t>ProductionDownloads</w:t>
-      </w:r>
-      <w:proofErr w:type="spellEnd"/>
+        <w:t>Table: ProductionDownloads</w:t>
+      </w:r>
     </w:p>
     <w:tbl>
       <w:tblPr>
@@ -2320,21 +1905,12 @@
                 <w:bCs/>
               </w:rPr>
             </w:pPr>
-            <w:proofErr w:type="spellStart"/>
             <w:r>
               <w:rPr>
                 <w:b/>
                 <w:bCs/>
               </w:rPr>
-              <w:t>Column</w:t>
-            </w:r>
-            <w:proofErr w:type="spellEnd"/>
-            <w:r>
-              <w:rPr>
-                <w:b/>
-                <w:bCs/>
-              </w:rPr>
-              <w:t xml:space="preserve"> Name</w:t>
+              <w:t>Column Name</w:t>
             </w:r>
           </w:p>
         </w:tc>
@@ -2394,11 +1970,9 @@
             <w:hideMark/>
           </w:tcPr>
           <w:p>
-            <w:proofErr w:type="spellStart"/>
             <w:r>
               <w:t>Id</w:t>
             </w:r>
-            <w:proofErr w:type="spellEnd"/>
           </w:p>
         </w:tc>
         <w:tc>
@@ -2440,11 +2014,9 @@
             <w:hideMark/>
           </w:tcPr>
           <w:p>
-            <w:proofErr w:type="spellStart"/>
             <w:r>
               <w:t>OrderId</w:t>
             </w:r>
-            <w:proofErr w:type="spellEnd"/>
           </w:p>
         </w:tc>
         <w:tc>
@@ -2479,20 +2051,7 @@
               <w:t>-</w:t>
             </w:r>
             <w:r>
-              <w:t xml:space="preserve"> </w:t>
-            </w:r>
-            <w:proofErr w:type="gramStart"/>
-            <w:r>
-              <w:t>Orders(</w:t>
-            </w:r>
-            <w:proofErr w:type="spellStart"/>
-            <w:proofErr w:type="gramEnd"/>
-            <w:r>
-              <w:t>Id</w:t>
-            </w:r>
-            <w:proofErr w:type="spellEnd"/>
-            <w:r>
-              <w:t>)</w:t>
+              <w:t xml:space="preserve"> Orders(Id)</w:t>
             </w:r>
           </w:p>
         </w:tc>
@@ -2508,11 +2067,9 @@
             <w:hideMark/>
           </w:tcPr>
           <w:p>
-            <w:proofErr w:type="spellStart"/>
             <w:r>
               <w:t>DownloadedAt</w:t>
             </w:r>
-            <w:proofErr w:type="spellEnd"/>
           </w:p>
         </w:tc>
         <w:tc>
@@ -2535,13 +2092,8 @@
           </w:tcPr>
           <w:p>
             <w:r>
-              <w:t xml:space="preserve">Time of </w:t>
-            </w:r>
-            <w:proofErr w:type="spellStart"/>
-            <w:r>
-              <w:t>download</w:t>
-            </w:r>
-            <w:proofErr w:type="spellEnd"/>
+              <w:t>Time of download</w:t>
+            </w:r>
           </w:p>
         </w:tc>
       </w:tr>
@@ -2568,36 +2120,21 @@
             <w:hideMark/>
           </w:tcPr>
           <w:p>
-            <w:proofErr w:type="gramStart"/>
-            <w:r>
-              <w:t>NVARCHAR(</w:t>
-            </w:r>
-            <w:proofErr w:type="gramEnd"/>
-            <w:r>
-              <w:t>50)</w:t>
-            </w:r>
-          </w:p>
-        </w:tc>
-        <w:tc>
-          <w:tcPr>
-            <w:tcW w:w="0" w:type="auto"/>
-            <w:vAlign w:val="center"/>
-            <w:hideMark/>
-          </w:tcPr>
-          <w:p>
-            <w:proofErr w:type="spellStart"/>
-            <w:r>
-              <w:t>Success</w:t>
-            </w:r>
-            <w:proofErr w:type="spellEnd"/>
-            <w:r>
-              <w:t xml:space="preserve"> / </w:t>
-            </w:r>
-            <w:proofErr w:type="spellStart"/>
-            <w:r>
-              <w:t>Failed</w:t>
-            </w:r>
-            <w:proofErr w:type="spellEnd"/>
+            <w:r>
+              <w:t>NVARCHAR(50)</w:t>
+            </w:r>
+          </w:p>
+        </w:tc>
+        <w:tc>
+          <w:tcPr>
+            <w:tcW w:w="0" w:type="auto"/>
+            <w:vAlign w:val="center"/>
+            <w:hideMark/>
+          </w:tcPr>
+          <w:p>
+            <w:r>
+              <w:t>Success / Failed</w:t>
+            </w:r>
           </w:p>
         </w:tc>
       </w:tr>
@@ -2858,21 +2395,7 @@
         <w:rPr>
           <w:lang w:val="en-US"/>
         </w:rPr>
-        <w:t>Tests (</w:t>
-      </w:r>
-      <w:proofErr w:type="spellStart"/>
-      <w:r>
-        <w:rPr>
-          <w:lang w:val="en-US"/>
-        </w:rPr>
-        <w:t>XUnit</w:t>
-      </w:r>
-      <w:proofErr w:type="spellEnd"/>
-      <w:r>
-        <w:rPr>
-          <w:lang w:val="en-US"/>
-        </w:rPr>
-        <w:t xml:space="preserve"> Test Project)</w:t>
+        <w:t>Tests (XUnit Test Project)</w:t>
       </w:r>
     </w:p>
     <w:p>
@@ -2938,35 +2461,7 @@
         <w:rPr>
           <w:lang w:val="en-US"/>
         </w:rPr>
-        <w:t xml:space="preserve">Other entities (Board, Component, </w:t>
-      </w:r>
-      <w:proofErr w:type="spellStart"/>
-      <w:r>
-        <w:rPr>
-          <w:lang w:val="en-US"/>
-        </w:rPr>
-        <w:t>BoardComponent</w:t>
-      </w:r>
-      <w:proofErr w:type="spellEnd"/>
-      <w:r>
-        <w:rPr>
-          <w:lang w:val="en-US"/>
-        </w:rPr>
-        <w:t xml:space="preserve">, Order, </w:t>
-      </w:r>
-      <w:proofErr w:type="spellStart"/>
-      <w:r>
-        <w:rPr>
-          <w:lang w:val="en-US"/>
-        </w:rPr>
-        <w:t>OrderBoard</w:t>
-      </w:r>
-      <w:proofErr w:type="spellEnd"/>
-      <w:r>
-        <w:rPr>
-          <w:lang w:val="en-US"/>
-        </w:rPr>
-        <w:t xml:space="preserve">) have been derived from the base Entity. </w:t>
+        <w:t xml:space="preserve">Other entities (Board, Component, BoardComponent, Order, OrderBoard) have been derived from the base Entity. </w:t>
       </w:r>
     </w:p>
     <w:p>
@@ -3016,7 +2511,6 @@
         </w:rPr>
         <w:t>Persistence (</w:t>
       </w:r>
-      <w:proofErr w:type="spellStart"/>
       <w:r>
         <w:rPr>
           <w:lang w:val="en-US"/>
@@ -3027,14 +2521,7 @@
         <w:rPr>
           <w:lang w:val="en-US"/>
         </w:rPr>
-        <w:t>DbContext</w:t>
-      </w:r>
-      <w:proofErr w:type="spellEnd"/>
-      <w:r>
-        <w:rPr>
-          <w:lang w:val="en-US"/>
-        </w:rPr>
-        <w:t>)</w:t>
+        <w:t>DbContext)</w:t>
       </w:r>
     </w:p>
     <w:p>
@@ -3076,27 +2563,7 @@
         <w:rPr>
           <w:lang w:val="en-US"/>
         </w:rPr>
-        <w:t xml:space="preserve"> and</w:t>
-      </w:r>
-      <w:r>
-        <w:rPr>
-          <w:lang w:val="en-US"/>
-        </w:rPr>
-        <w:t xml:space="preserve"> contain the implementation of CRUD operations for entities managed by </w:t>
-      </w:r>
-      <w:proofErr w:type="spellStart"/>
-      <w:r>
-        <w:rPr>
-          <w:lang w:val="en-US"/>
-        </w:rPr>
-        <w:t>DbContext</w:t>
-      </w:r>
-      <w:proofErr w:type="spellEnd"/>
-      <w:r>
-        <w:rPr>
-          <w:lang w:val="en-US"/>
-        </w:rPr>
-        <w:t>)</w:t>
+        <w:t xml:space="preserve"> and contain the implementation of CRUD operations for entities managed by DbContext)</w:t>
       </w:r>
     </w:p>
     <w:p>
@@ -3239,10 +2706,88 @@
     </w:p>
     <w:p>
       <w:pPr>
-        <w:rPr>
-          <w:lang w:val="en-US"/>
-        </w:rPr>
-      </w:pPr>
+        <w:jc w:val="center"/>
+        <w:rPr>
+          <w:b/>
+          <w:bCs/>
+          <w:sz w:val="32"/>
+          <w:szCs w:val="32"/>
+          <w:lang w:val="en-US"/>
+        </w:rPr>
+      </w:pPr>
+      <w:r>
+        <w:rPr>
+          <w:b/>
+          <w:bCs/>
+          <w:sz w:val="32"/>
+          <w:szCs w:val="32"/>
+          <w:lang w:val="en-US"/>
+        </w:rPr>
+        <w:lastRenderedPageBreak/>
+        <w:t xml:space="preserve">Problems </w:t>
+      </w:r>
+      <w:r>
+        <w:rPr>
+          <w:b/>
+          <w:bCs/>
+          <w:sz w:val="32"/>
+          <w:szCs w:val="32"/>
+          <w:lang w:val="en-US"/>
+        </w:rPr>
+        <w:t>that</w:t>
+      </w:r>
+      <w:r>
+        <w:rPr>
+          <w:b/>
+          <w:bCs/>
+          <w:sz w:val="32"/>
+          <w:szCs w:val="32"/>
+          <w:lang w:val="en-US"/>
+        </w:rPr>
+        <w:t xml:space="preserve"> occur during development</w:t>
+      </w:r>
+    </w:p>
+    <w:p>
+      <w:pPr>
+        <w:rPr>
+          <w:b/>
+          <w:bCs/>
+          <w:lang w:val="en-US"/>
+        </w:rPr>
+      </w:pPr>
+      <w:r>
+        <w:rPr>
+          <w:b/>
+          <w:bCs/>
+          <w:lang w:val="en-US"/>
+        </w:rPr>
+        <w:t>Serialization Problem when Downloading the Order:</w:t>
+      </w:r>
+    </w:p>
+    <w:p>
+      <w:pPr>
+        <w:rPr>
+          <w:lang w:val="en-US"/>
+        </w:rPr>
+      </w:pPr>
+      <w:r>
+        <w:rPr>
+          <w:lang w:val="en-US"/>
+        </w:rPr>
+        <w:t>Previously, EF Core entity classes were used directly for JSON serialization. This approach resulted in a runtime error due to circular references within the entity graph. Because Orders and Boards have a many-to-many relationship, EF Core creates bi-directional navigation properties, which led to an infinite reference loop during serialization. To resolve this issue,</w:t>
+      </w:r>
+      <w:r>
+        <w:rPr>
+          <w:lang w:val="en-US"/>
+        </w:rPr>
+        <w:t xml:space="preserve"> </w:t>
+      </w:r>
+      <w:r>
+        <w:rPr>
+          <w:lang w:val="en-US"/>
+        </w:rPr>
+        <w:t>DTOs are now used to control the object graph and ensure safe, predictable JSON serialization.</w:t>
+      </w:r>
     </w:p>
     <w:p>
       <w:pPr>

</xml_diff>